<commit_message>
added tests and improved docks
</commit_message>
<xml_diff>
--- a/Docs/Word/UseCase.docx
+++ b/Docs/Word/UseCase.docx
@@ -12,17 +12,16 @@
           <w:szCs w:val="24"/>
         </w:rPr>
       </w:pPr>
-      <w:bookmarkStart w:id="0" w:name="_GoBack"/>
       <w:r>
         <w:rPr>
           <w:noProof/>
           <w:lang w:val="ru-RU" w:eastAsia="ru-RU"/>
         </w:rPr>
         <w:drawing>
-          <wp:inline distT="0" distB="0" distL="0" distR="0" wp14:anchorId="1C9E8A07" wp14:editId="7B3DE7BF">
-            <wp:extent cx="8049491" cy="7685444"/>
-            <wp:effectExtent l="0" t="0" r="8890" b="0"/>
-            <wp:docPr id="2" name="Рисунок 2"/>
+          <wp:inline distT="0" distB="0" distL="0" distR="0" wp14:anchorId="3FB64AE5" wp14:editId="11FBDCBA">
+            <wp:extent cx="7749676" cy="7391400"/>
+            <wp:effectExtent l="0" t="0" r="3810" b="0"/>
+            <wp:docPr id="4" name="Рисунок 4"/>
             <wp:cNvGraphicFramePr>
               <a:graphicFrameLocks xmlns:a="http://schemas.openxmlformats.org/drawingml/2006/main" noChangeAspect="1"/>
             </wp:cNvGraphicFramePr>
@@ -30,7 +29,7 @@
               <a:graphicData uri="http://schemas.openxmlformats.org/drawingml/2006/picture">
                 <pic:pic xmlns:pic="http://schemas.openxmlformats.org/drawingml/2006/picture">
                   <pic:nvPicPr>
-                    <pic:cNvPr id="2" name="UseCase.png"/>
+                    <pic:cNvPr id="4" name="UseCase.png"/>
                     <pic:cNvPicPr/>
                   </pic:nvPicPr>
                   <pic:blipFill>
@@ -48,7 +47,7 @@
                   <pic:spPr>
                     <a:xfrm>
                       <a:off x="0" y="0"/>
-                      <a:ext cx="8064662" cy="7699929"/>
+                      <a:ext cx="7759990" cy="7401237"/>
                     </a:xfrm>
                     <a:prstGeom prst="rect">
                       <a:avLst/>
@@ -60,6 +59,7 @@
           </wp:inline>
         </w:drawing>
       </w:r>
+      <w:bookmarkStart w:id="0" w:name="_GoBack"/>
       <w:bookmarkEnd w:id="0"/>
       <w:r>
         <w:rPr>
@@ -69,7 +69,7 @@
         <mc:AlternateContent>
           <mc:Choice Requires="wpg">
             <w:drawing>
-              <wp:anchor distT="0" distB="0" distL="114300" distR="114300" simplePos="0" relativeHeight="251659264" behindDoc="0" locked="0" layoutInCell="1" allowOverlap="1" wp14:anchorId="6606EE77" wp14:editId="20B8533A">
+              <wp:anchor distT="0" distB="0" distL="114300" distR="114300" simplePos="0" relativeHeight="251659264" behindDoc="0" locked="0" layoutInCell="1" allowOverlap="1" wp14:anchorId="6606EE77" wp14:editId="1F35E4DA">
                 <wp:simplePos x="0" y="0"/>
                 <wp:positionH relativeFrom="margin">
                   <wp:align>center</wp:align>
@@ -3875,7 +3875,7 @@
 </file>
 
 <file path=customXml/itemProps1.xml><?xml version="1.0" encoding="utf-8"?>
-<ds:datastoreItem xmlns:ds="http://schemas.openxmlformats.org/officeDocument/2006/customXml" ds:itemID="{16F33CEB-1934-491C-9E84-FAFE6A5AB17F}">
+<ds:datastoreItem xmlns:ds="http://schemas.openxmlformats.org/officeDocument/2006/customXml" ds:itemID="{AB273384-6C50-468C-B829-FC6A875BB4AC}">
   <ds:schemaRefs>
     <ds:schemaRef ds:uri="http://schemas.openxmlformats.org/officeDocument/2006/bibliography"/>
   </ds:schemaRefs>

</xml_diff>